<commit_message>
Add plot saving to fish visualization
</commit_message>
<xml_diff>
--- a/Behavior analysis pipeline v2.docx
+++ b/Behavior analysis pipeline v2.docx
@@ -49,10 +49,7 @@
         <w:t xml:space="preserve">Last modified: </w:t>
       </w:r>
       <w:r>
-        <w:t xml:space="preserve">February </w:t>
-      </w:r>
-      <w:r>
-        <w:t>20</w:t>
+        <w:t>March 1</w:t>
       </w:r>
       <w:r>
         <w:t>,</w:t>
@@ -14424,19 +14421,7 @@
         <w:t>contact_head_body</w:t>
       </w:r>
       <w:r>
-        <w:t xml:space="preserve">: frames in which there is head-body contact behavior, a subset of </w:t>
-      </w:r>
-      <w:r>
-        <w:t>“</w:t>
-      </w:r>
-      <w:r>
-        <w:t>any</w:t>
-      </w:r>
-      <w:r>
-        <w:t>”</w:t>
-      </w:r>
-      <w:r>
-        <w:t xml:space="preserve"> contact; a list of dictionaries (see </w:t>
+        <w:t xml:space="preserve">: frames in which there is head-body contact behavior, a subset of “any” contact; a list of dictionaries (see </w:t>
       </w:r>
       <w:r>
         <w:rPr>
@@ -14472,25 +14457,7 @@
         <w:t>head</w:t>
       </w:r>
       <w:r>
-        <w:t>: frames in which there is head-</w:t>
-      </w:r>
-      <w:r>
-        <w:t>head</w:t>
-      </w:r>
-      <w:r>
-        <w:t xml:space="preserve"> contact behavior, a subset of </w:t>
-      </w:r>
-      <w:r>
-        <w:t>“</w:t>
-      </w:r>
-      <w:r>
-        <w:t>any</w:t>
-      </w:r>
-      <w:r>
-        <w:t>”</w:t>
-      </w:r>
-      <w:r>
-        <w:t xml:space="preserve"> contact; a list of dictionaries (see </w:t>
+        <w:t xml:space="preserve">: frames in which there is head-head contact behavior, a subset of “any” contact; a list of dictionaries (see </w:t>
       </w:r>
       <w:r>
         <w:rPr>
@@ -14500,10 +14467,7 @@
         <w:t>behavior dictionaries</w:t>
       </w:r>
       <w:r>
-        <w:t>, below).</w:t>
-      </w:r>
-      <w:r>
-        <w:t xml:space="preserve"> Note that these frames will also be in </w:t>
+        <w:t xml:space="preserve">, below). Note that these frames will also be in </w:t>
       </w:r>
       <w:r>
         <w:rPr>
@@ -15971,6 +15935,15 @@
       <w:r>
         <w:t>Displays fish body positions, inter-fish vector, and heading vectors, along with text information such as relative orientation.</w:t>
       </w:r>
+      <w:r>
+        <w:t xml:space="preserve"> Can also save an image of the </w:t>
+      </w:r>
+      <w:r>
+        <w:t xml:space="preserve">current </w:t>
+      </w:r>
+      <w:r>
+        <w:t>plot.</w:t>
+      </w:r>
     </w:p>
     <w:p>
       <w:r>
@@ -16144,7 +16117,49 @@
         <w:t>CSVcolumns = all_CSV['CSVcolumns']</w:t>
       </w:r>
     </w:p>
-    <w:p/>
+    <w:p>
+      <w:r>
+        <w:t xml:space="preserve">To </w:t>
+      </w:r>
+      <w:r>
+        <w:t>list</w:t>
+      </w:r>
+      <w:r>
+        <w:t xml:space="preserve"> dataset indexes:</w:t>
+      </w:r>
+    </w:p>
+    <w:p>
+      <w:pPr>
+        <w:ind w:left="720"/>
+        <w:rPr>
+          <w:rFonts w:ascii="Courier New" w:hAnsi="Courier New" w:cs="Courier New"/>
+          <w:sz w:val="22"/>
+        </w:rPr>
+      </w:pPr>
+      <w:r>
+        <w:rPr>
+          <w:rFonts w:ascii="Courier New" w:hAnsi="Courier New" w:cs="Courier New"/>
+          <w:sz w:val="22"/>
+        </w:rPr>
+        <w:t>for j in range(len(datasets)):</w:t>
+      </w:r>
+    </w:p>
+    <w:p>
+      <w:pPr>
+        <w:ind w:left="720"/>
+        <w:rPr>
+          <w:rFonts w:ascii="Courier New" w:hAnsi="Courier New" w:cs="Courier New"/>
+          <w:sz w:val="22"/>
+        </w:rPr>
+      </w:pPr>
+      <w:r>
+        <w:rPr>
+          <w:rFonts w:ascii="Courier New" w:hAnsi="Courier New" w:cs="Courier New"/>
+          <w:sz w:val="22"/>
+        </w:rPr>
+        <w:t xml:space="preserve">    print(f'{j}: {datasets[j]['dataset_name']}')</w:t>
+      </w:r>
+    </w:p>
     <w:p>
       <w:r>
         <w:t>To run the visualization:</w:t>
@@ -16202,6 +16217,13 @@
         </w:rPr>
         <w:t xml:space="preserve"> # or whatever dataset index</w:t>
       </w:r>
+      <w:r>
+        <w:rPr>
+          <w:rFonts w:ascii="Courier New" w:hAnsi="Courier New" w:cs="Courier New"/>
+          <w:sz w:val="22"/>
+        </w:rPr>
+        <w:t xml:space="preserve"> you want</w:t>
+      </w:r>
     </w:p>
     <w:p>
       <w:pPr>
@@ -16239,6 +16261,18 @@
       </w:r>
       <w:r>
         <w:t xml:space="preserve"> Note that “v” toggles additional information.</w:t>
+      </w:r>
+      <w:r>
+        <w:t xml:space="preserve"> Minor changes noted in </w:t>
+      </w:r>
+      <w:r>
+        <w:t xml:space="preserve">“Code notes </w:t>
+      </w:r>
+      <w:r>
+        <w:t>Feb 2026</w:t>
+      </w:r>
+      <w:r>
+        <w:t>.docx”</w:t>
       </w:r>
     </w:p>
     <w:p/>
@@ -16268,6 +16302,7 @@
           <w:sz w:val="20"/>
           <w:szCs w:val="20"/>
         </w:rPr>
+        <w:lastRenderedPageBreak/>
         <w:t xml:space="preserve">  u: +1 frame    t: -1 frame</w:t>
       </w:r>
     </w:p>
@@ -16319,7 +16354,6 @@
           <w:sz w:val="20"/>
           <w:szCs w:val="20"/>
         </w:rPr>
-        <w:lastRenderedPageBreak/>
         <w:t xml:space="preserve">  p: +1000 frames w: -1000 frames</w:t>
       </w:r>
     </w:p>
@@ -16355,6 +16389,23 @@
           <w:szCs w:val="20"/>
         </w:rPr>
         <w:t xml:space="preserve">  z: toggle autoscaling (on/off)</w:t>
+      </w:r>
+    </w:p>
+    <w:p>
+      <w:pPr>
+        <w:rPr>
+          <w:rFonts w:ascii="Courier New" w:hAnsi="Courier New" w:cs="Courier New"/>
+          <w:sz w:val="20"/>
+          <w:szCs w:val="20"/>
+        </w:rPr>
+      </w:pPr>
+      <w:r>
+        <w:rPr>
+          <w:rFonts w:ascii="Courier New" w:hAnsi="Courier New" w:cs="Courier New"/>
+          <w:sz w:val="20"/>
+          <w:szCs w:val="20"/>
+        </w:rPr>
+        <w:t xml:space="preserve">  s: save current figure as fish_position_plot_idx&lt;N&gt;.png</w:t>
       </w:r>
     </w:p>
     <w:p/>
@@ -16511,6 +16562,7 @@
           <w:rFonts w:ascii="Courier New" w:hAnsi="Courier New" w:cs="Courier New"/>
           <w:sz w:val="22"/>
         </w:rPr>
+        <w:lastRenderedPageBreak/>
         <w:t>(datasets, CSVcolumns, expt_config, params, N_datasets, Nfish, basePath, dataPath, subGroupName) = variable_tuple</w:t>
       </w:r>
     </w:p>
@@ -16557,7 +16609,6 @@
     </w:p>
     <w:p>
       <w:r>
-        <w:lastRenderedPageBreak/>
         <w:t xml:space="preserve">See also </w:t>
       </w:r>
       <w:r>
@@ -17019,6 +17070,7 @@
           <w:sz w:val="20"/>
           <w:szCs w:val="20"/>
         </w:rPr>
+        <w:lastRenderedPageBreak/>
         <w:t>constraintIdx = None</w:t>
       </w:r>
     </w:p>
@@ -17136,7 +17188,6 @@
           <w:sz w:val="20"/>
           <w:szCs w:val="20"/>
         </w:rPr>
-        <w:lastRenderedPageBreak/>
         <w:t>y</w:t>
       </w:r>
       <w:r>
@@ -17995,6 +18046,7 @@
           <w:rFonts w:ascii="Courier New" w:hAnsi="Courier New" w:cs="Courier New"/>
           <w:sz w:val="22"/>
         </w:rPr>
+        <w:lastRenderedPageBreak/>
         <w:t>_</w:t>
       </w:r>
       <w:r>
@@ -18101,7 +18153,6 @@
           <w:rFonts w:ascii="Courier New" w:hAnsi="Courier New" w:cs="Courier New"/>
           <w:sz w:val="22"/>
         </w:rPr>
-        <w:lastRenderedPageBreak/>
         <w:t>xlabelStr= xlabelStr, ylabelStr= ylabelStr,</w:t>
       </w:r>
     </w:p>
@@ -18381,6 +18432,7 @@
         <w:pStyle w:val="Heading1"/>
       </w:pPr>
       <w:r>
+        <w:lastRenderedPageBreak/>
         <w:t>Sort these things</w:t>
       </w:r>
     </w:p>
@@ -18678,7 +18730,6 @@
     </w:p>
     <w:p>
       <w:r>
-        <w:lastRenderedPageBreak/>
         <w:t xml:space="preserve">Calculate cross-correlations between fish of speed (or any other variable), binned as a function of distance (or any other parameter). For example, we may wish to see the decay of inter-fish responses with separation. </w:t>
       </w:r>
     </w:p>
@@ -18974,6 +19025,7 @@
           <w:rFonts w:ascii="Courier New" w:hAnsi="Courier New" w:cs="Courier New"/>
           <w:sz w:val="22"/>
         </w:rPr>
+        <w:lastRenderedPageBreak/>
         <w:t xml:space="preserve">from </w:t>
       </w:r>
       <w:r>
@@ -19039,7 +19091,6 @@
           <w:rFonts w:ascii="Courier New" w:hAnsi="Courier New" w:cs="Courier New"/>
           <w:sz w:val="22"/>
         </w:rPr>
-        <w:lastRenderedPageBreak/>
         <w:t>qproperty = 'relative_orientation'</w:t>
       </w:r>
     </w:p>
@@ -19444,7 +19495,11 @@
         <w:t>C_delta_f</w:t>
       </w:r>
       <w:r>
-        <w:t xml:space="preserve">, a tuple of default (0, 1), such that we only consider events of Behavior A if the start of a Behavior C event occurs within [C_delta_f[0], C_delta_f[1]] frames of the start of the behavior A event. </w:t>
+        <w:t xml:space="preserve">, a tuple of default (0, 1), such that we </w:t>
+      </w:r>
+      <w:r>
+        <w:lastRenderedPageBreak/>
+        <w:t xml:space="preserve">only consider events of Behavior A if the start of a Behavior C event occurs within [C_delta_f[0], C_delta_f[1]] frames of the start of the behavior A event. </w:t>
       </w:r>
     </w:p>
     <w:p>
@@ -19482,11 +19537,7 @@
         <w:t xml:space="preserve"> is met. </w:t>
       </w:r>
       <w:r>
-        <w:t xml:space="preserve">Note that constraintIdx can be ('min', 'max', 'mean', 'min_abs', </w:t>
-      </w:r>
-      <w:r>
-        <w:lastRenderedPageBreak/>
-        <w:t>'max_abs', 'mean_abs'). 'min' returns the min along axis=1, i.e. the value of the lowest fish. 'min_abs' returns the min of the abs val along axis=1. Similar for other operations</w:t>
+        <w:t>Note that constraintIdx can be ('min', 'max', 'mean', 'min_abs', 'max_abs', 'mean_abs'). 'min' returns the min along axis=1, i.e. the value of the lowest fish. 'min_abs' returns the min of the abs val along axis=1. Similar for other operations</w:t>
       </w:r>
       <w:r>
         <w:t>. ConstraintIdx</w:t>
@@ -20087,7 +20138,6 @@
           <w:sz w:val="20"/>
           <w:szCs w:val="20"/>
         </w:rPr>
-        <w:lastRenderedPageBreak/>
         <w:t>corr_asymm = calc_corr_asymm(behav_corr_allSets['DeltaCorr'], behavior_key_list_subset, binCenters, maxFrameDelay = None, normalization = 'none')</w:t>
       </w:r>
     </w:p>
@@ -20623,6 +20673,7 @@
           <w:rFonts w:ascii="Courier New" w:hAnsi="Courier New" w:cs="Courier New"/>
           <w:sz w:val="22"/>
         </w:rPr>
+        <w:lastRenderedPageBreak/>
         <w:t xml:space="preserve">outputPicklePathName = </w:t>
       </w:r>
       <w:r>
@@ -20666,7 +20717,6 @@
           <w:rFonts w:ascii="Courier New" w:hAnsi="Courier New" w:cs="Courier New"/>
           <w:sz w:val="22"/>
         </w:rPr>
-        <w:lastRenderedPageBreak/>
         <w:t xml:space="preserve">save_correlation_pickle(outputPickleFileName, </w:t>
       </w:r>
       <w:r>
@@ -21065,6 +21115,7 @@
           <w:sz w:val="20"/>
           <w:szCs w:val="20"/>
         </w:rPr>
+        <w:lastRenderedPageBreak/>
         <w:t>r_mm_all_close = combine_all_values_constrained(datasets, keyName='radial_position_mm', constraintKey='head_head_distance_mm', constraintRange=[0.0, 5.0], dilate_</w:t>
       </w:r>
       <w:r>
@@ -21210,7 +21261,6 @@
           <w:sz w:val="20"/>
           <w:szCs w:val="20"/>
         </w:rPr>
-        <w:lastRenderedPageBreak/>
         <w:t xml:space="preserve">plot_sem_band = </w:t>
       </w:r>
       <w:r>
@@ -21440,6 +21490,7 @@
           <w:rFonts w:ascii="Courier New" w:hAnsi="Courier New" w:cs="Courier New"/>
           <w:sz w:val="22"/>
         </w:rPr>
+        <w:lastRenderedPageBreak/>
         <w:t>average_bout_trajectory_oneSet():</w:t>
       </w:r>
       <w:r>
@@ -21452,7 +21503,6 @@
           <w:rFonts w:ascii="Courier New" w:hAnsi="Courier New" w:cs="Courier New"/>
           <w:sz w:val="22"/>
         </w:rPr>
-        <w:lastRenderedPageBreak/>
         <w:t>average_bout_trajectory_allSets</w:t>
       </w:r>
       <w:r>
@@ -21655,6 +21705,7 @@
           <w:rFonts w:ascii="Courier New" w:hAnsi="Courier New" w:cs="Courier New"/>
           <w:sz w:val="22"/>
         </w:rPr>
+        <w:lastRenderedPageBreak/>
         <w:t>combine_all_</w:t>
       </w:r>
       <w:r>
@@ -21691,11 +21742,7 @@
         <w:t>1; do this for speed values, since bad tracking affects adjacent frames! List contains one numpy array per dataset</w:t>
       </w:r>
       <w:r>
-        <w:t xml:space="preserve"> (possibly with multiple columns </w:t>
-      </w:r>
-      <w:r>
-        <w:lastRenderedPageBreak/>
-        <w:t>corresponding to fish)</w:t>
+        <w:t xml:space="preserve"> (possibly with multiple columns corresponding to fish)</w:t>
       </w:r>
       <w:r>
         <w:t>. Output can be used, for example, for making a histogram of speeds or inter-fish distance.</w:t>

</xml_diff>